<commit_message>
Added sprint retrospective (final version) and concise change log
</commit_message>
<xml_diff>
--- a/Documents/Sprint Retrospective - Week 13.docx
+++ b/Documents/Sprint Retrospective - Week 13.docx
@@ -40,7 +40,7 @@
         <w:rPr>
           <w:rFonts w:ascii="Helvetica" w:hAnsi="Helvetica" w:cs="Helvetica"/>
         </w:rPr>
-        <w:t xml:space="preserve"> +</w:t>
+        <w:t>+</w:t>
       </w:r>
     </w:p>
     <w:p>
@@ -72,13 +72,6 @@
           <w:b/>
         </w:rPr>
         <w:t>Retrospective Format:</w:t>
-      </w:r>
-      <w:r>
-        <w:rPr>
-          <w:rFonts w:ascii="Helvetica" w:hAnsi="Helvetica" w:cs="Helvetica"/>
-          <w:b/>
-        </w:rPr>
-        <w:t xml:space="preserve"> </w:t>
       </w:r>
       <w:r>
         <w:rPr>
@@ -233,8 +226,32 @@
       <w:r>
         <w:rPr>
           <w:rFonts w:ascii="Helvetica" w:hAnsi="Helvetica" w:cs="Helvetica"/>
-          <w:b/>
-        </w:rPr>
+        </w:rPr>
+        <w:t xml:space="preserve">The team also learned from the final </w:t>
+      </w:r>
+      <w:proofErr w:type="spellStart"/>
+      <w:r>
+        <w:rPr>
+          <w:rFonts w:ascii="Helvetica" w:hAnsi="Helvetica" w:cs="Helvetica"/>
+        </w:rPr>
+        <w:t>JaCoCo</w:t>
+      </w:r>
+      <w:proofErr w:type="spellEnd"/>
+      <w:r>
+        <w:rPr>
+          <w:rFonts w:ascii="Helvetica" w:hAnsi="Helvetica" w:cs="Helvetica"/>
+        </w:rPr>
+        <w:t xml:space="preserve"> coverage report. The core backend and game-logic packages had stronger coverage than the overall project average, but JavaFX controller coverage was low. This showed that our automated testing was strongest around high-risk model, database, and service logic, while UI controller behaviour was mostly validated through usability testing and manual walkthroughs.</w:t>
+      </w:r>
+    </w:p>
+    <w:p/>
+    <w:p>
+      <w:r>
+        <w:rPr>
+          <w:rFonts w:ascii="Helvetica" w:hAnsi="Helvetica" w:cs="Helvetica"/>
+          <w:b/>
+        </w:rPr>
+        <w:lastRenderedPageBreak/>
         <w:t>Lacked</w:t>
       </w:r>
     </w:p>
@@ -269,6 +286,15 @@
       <w:r>
         <w:rPr>
           <w:rFonts w:ascii="Helvetica" w:hAnsi="Helvetica" w:cs="Helvetica"/>
+        </w:rPr>
+        <w:t>The team also lacked automated coverage for JavaFX controller behaviour. This did not mean UI quality was ignored, because UI quality was assessed through user testing and manual validation, but it does show a clear future improvement area for automated quality assurance.</w:t>
+      </w:r>
+    </w:p>
+    <w:p/>
+    <w:p>
+      <w:r>
+        <w:rPr>
+          <w:rFonts w:ascii="Helvetica" w:hAnsi="Helvetica" w:cs="Helvetica"/>
           <w:b/>
         </w:rPr>
         <w:t>Longed For</w:t>
@@ -288,7 +314,14 @@
         <w:rPr>
           <w:rFonts w:ascii="Helvetica" w:hAnsi="Helvetica" w:cs="Helvetica"/>
         </w:rPr>
-        <w:t>The team would also improve communication around blockers. When a member is delayed or unsure whether a task will be finished on time, the team should raise that earlier so the workload can be adjusted. This would create more realistic expectations and reduce last-minute pressure.</w:t>
+        <w:t xml:space="preserve">The team would also improve communication around blockers. When a member is delayed or unsure whether a task will be finished on time, the team should </w:t>
+      </w:r>
+      <w:r>
+        <w:rPr>
+          <w:rFonts w:ascii="Helvetica" w:hAnsi="Helvetica" w:cs="Helvetica"/>
+        </w:rPr>
+        <w:lastRenderedPageBreak/>
+        <w:t>raise that earlier so the workload can be adjusted. This would create more realistic expectations and reduce last-minute pressure.</w:t>
       </w:r>
     </w:p>
     <w:p/>
@@ -301,81 +334,145 @@
       </w:r>
     </w:p>
     <w:p/>
-    <w:p/>
-    <w:p/>
-    <w:p/>
-    <w:p>
-      <w:r>
-        <w:rPr>
-          <w:rFonts w:ascii="Helvetica" w:hAnsi="Helvetica" w:cs="Helvetica"/>
-          <w:b/>
+    <w:p>
+      <w:r>
+        <w:rPr>
+          <w:rFonts w:ascii="Helvetica" w:hAnsi="Helvetica" w:cs="Helvetica"/>
+        </w:rPr>
+        <w:t xml:space="preserve">The team would also improve automated quality assessment by adding controller-level or </w:t>
+      </w:r>
+      <w:proofErr w:type="spellStart"/>
+      <w:r>
+        <w:rPr>
+          <w:rFonts w:ascii="Helvetica" w:hAnsi="Helvetica" w:cs="Helvetica"/>
+        </w:rPr>
+        <w:t>TestFX</w:t>
+      </w:r>
+      <w:proofErr w:type="spellEnd"/>
+      <w:r>
+        <w:rPr>
+          <w:rFonts w:ascii="Helvetica" w:hAnsi="Helvetica" w:cs="Helvetica"/>
+        </w:rPr>
+        <w:t xml:space="preserve"> tests for JavaFX UI behaviour, and by mocking AI HTTP responses so AI-related tests can run reliably without a live API key.</w:t>
+      </w:r>
+    </w:p>
+    <w:p/>
+    <w:p>
+      <w:r>
+        <w:rPr>
+          <w:rFonts w:ascii="Helvetica" w:hAnsi="Helvetica" w:cs="Helvetica"/>
+          <w:b/>
+        </w:rPr>
+        <w:t>Actions For Future Improvement</w:t>
+      </w:r>
+    </w:p>
+    <w:p>
+      <w:r>
+        <w:rPr>
+          <w:rFonts w:ascii="Helvetica" w:hAnsi="Helvetica" w:cs="Helvetica"/>
+        </w:rPr>
+        <w:t>1. Start final presentation scripting and evidence collection earlier in the sprint.</w:t>
+      </w:r>
+    </w:p>
+    <w:p>
+      <w:r>
+        <w:rPr>
+          <w:rFonts w:ascii="Helvetica" w:hAnsi="Helvetica" w:cs="Helvetica"/>
+        </w:rPr>
+        <w:t>2. Keep a dedicated retrospective document after each major sprint instead of relying only on meeting notes.</w:t>
+      </w:r>
+    </w:p>
+    <w:p>
+      <w:r>
+        <w:rPr>
+          <w:rFonts w:ascii="Helvetica" w:hAnsi="Helvetica" w:cs="Helvetica"/>
+        </w:rPr>
+        <w:t>3. Convert user feedback into prioritised action items immediately after testing.</w:t>
+      </w:r>
+    </w:p>
+    <w:p>
+      <w:r>
+        <w:rPr>
+          <w:rFonts w:ascii="Helvetica" w:hAnsi="Helvetica" w:cs="Helvetica"/>
+        </w:rPr>
+        <w:t>4. Raise blockers earlier so tasks can be reassigned or reduced in scope before they affect the team timeline.</w:t>
+      </w:r>
+    </w:p>
+    <w:p>
+      <w:r>
+        <w:rPr>
+          <w:rFonts w:ascii="Helvetica" w:hAnsi="Helvetica" w:cs="Helvetica"/>
+        </w:rPr>
+        <w:t>5. Continue linking each quality improvement to tests, commits, or project management artefacts so evidence is easy for markers to verify.</w:t>
+      </w:r>
+    </w:p>
+    <w:p>
+      <w:r>
+        <w:rPr>
+          <w:rFonts w:ascii="Helvetica" w:hAnsi="Helvetica" w:cs="Helvetica"/>
+        </w:rPr>
+        <w:t xml:space="preserve">6. Add controller-level or </w:t>
+      </w:r>
+      <w:proofErr w:type="spellStart"/>
+      <w:r>
+        <w:rPr>
+          <w:rFonts w:ascii="Helvetica" w:hAnsi="Helvetica" w:cs="Helvetica"/>
+        </w:rPr>
+        <w:t>TestFX</w:t>
+      </w:r>
+      <w:proofErr w:type="spellEnd"/>
+      <w:r>
+        <w:rPr>
+          <w:rFonts w:ascii="Helvetica" w:hAnsi="Helvetica" w:cs="Helvetica"/>
+        </w:rPr>
+        <w:t xml:space="preserve"> tests to improve automated coverage of JavaFX UI behaviour.</w:t>
+      </w:r>
+    </w:p>
+    <w:p>
+      <w:r>
+        <w:rPr>
+          <w:rFonts w:ascii="Helvetica" w:hAnsi="Helvetica" w:cs="Helvetica"/>
+        </w:rPr>
+        <w:t>7. Mock AI HTTP/API responses in tests so AI reliability can be assessed without depending on a live API key or network access.</w:t>
+      </w:r>
+    </w:p>
+    <w:p/>
+    <w:p>
+      <w:r>
+        <w:rPr>
+          <w:rFonts w:ascii="Helvetica" w:hAnsi="Helvetica" w:cs="Helvetica"/>
+          <w:b/>
+        </w:rPr>
+        <w:t>Evidence Links</w:t>
+      </w:r>
+    </w:p>
+    <w:p>
+      <w:r>
+        <w:rPr>
+          <w:rFonts w:ascii="Helvetica" w:hAnsi="Helvetica" w:cs="Helvetica"/>
+        </w:rPr>
+        <w:t xml:space="preserve">Meeting notes and reflective discussion: </w:t>
+      </w:r>
+      <w:r>
+        <w:rPr>
+          <w:rFonts w:ascii="Courier New" w:hAnsi="Courier New" w:cs="Courier New"/>
+        </w:rPr>
+        <w:t>Documents/Meetings Journal</w:t>
+      </w:r>
+    </w:p>
+    <w:p>
+      <w:r>
+        <w:rPr>
+          <w:rFonts w:ascii="Arial" w:hAnsi="Arial" w:cs="Arial"/>
         </w:rPr>
         <w:lastRenderedPageBreak/>
-        <w:t>Actions For Future Improvement</w:t>
-      </w:r>
-    </w:p>
-    <w:p>
-      <w:r>
-        <w:rPr>
-          <w:rFonts w:ascii="Helvetica" w:hAnsi="Helvetica" w:cs="Helvetica"/>
-        </w:rPr>
-        <w:t>1. Start final presentation scripting and evidence collection earlier in the sprint.</w:t>
-      </w:r>
-    </w:p>
-    <w:p>
-      <w:r>
-        <w:rPr>
-          <w:rFonts w:ascii="Helvetica" w:hAnsi="Helvetica" w:cs="Helvetica"/>
-        </w:rPr>
-        <w:t>2. Keep a dedicated retrospective document after each major sprint instead of relying only on meeting notes.</w:t>
-      </w:r>
-    </w:p>
-    <w:p>
-      <w:r>
-        <w:rPr>
-          <w:rFonts w:ascii="Helvetica" w:hAnsi="Helvetica" w:cs="Helvetica"/>
-        </w:rPr>
-        <w:t>3. Convert user feedback into prioritised action items immediately after testing.</w:t>
-      </w:r>
-    </w:p>
-    <w:p>
-      <w:r>
-        <w:rPr>
-          <w:rFonts w:ascii="Helvetica" w:hAnsi="Helvetica" w:cs="Helvetica"/>
-        </w:rPr>
-        <w:t>4. Raise blockers earlier so tasks can be reassigned or reduced in scope before they affect the team timeline.</w:t>
-      </w:r>
-    </w:p>
-    <w:p>
-      <w:r>
-        <w:rPr>
-          <w:rFonts w:ascii="Helvetica" w:hAnsi="Helvetica" w:cs="Helvetica"/>
-        </w:rPr>
-        <w:t>5. Continue linking each quality improvement to tests, commits, or project management artefacts so evidence is easy for markers to verify.</w:t>
-      </w:r>
-    </w:p>
-    <w:p/>
-    <w:p>
-      <w:r>
-        <w:rPr>
-          <w:rFonts w:ascii="Helvetica" w:hAnsi="Helvetica" w:cs="Helvetica"/>
-          <w:b/>
-        </w:rPr>
-        <w:t>Evidence Links</w:t>
-      </w:r>
-    </w:p>
-    <w:p>
-      <w:r>
-        <w:rPr>
-          <w:rFonts w:ascii="Helvetica" w:hAnsi="Helvetica" w:cs="Helvetica"/>
-        </w:rPr>
-        <w:t xml:space="preserve">Meeting notes and reflective discussion: </w:t>
+        <w:t xml:space="preserve">User feedback and prioritised improvements: </w:t>
       </w:r>
       <w:r>
         <w:rPr>
           <w:rFonts w:ascii="Courier New" w:hAnsi="Courier New" w:cs="Courier New"/>
         </w:rPr>
-        <w:t>Documents/Meetings Journal</w:t>
+        <w:t>Documents/User Feedback and Interview Questions.docx</w:t>
       </w:r>
     </w:p>
     <w:p>
@@ -383,13 +480,13 @@
         <w:rPr>
           <w:rFonts w:ascii="Arial" w:hAnsi="Arial" w:cs="Arial"/>
         </w:rPr>
-        <w:t xml:space="preserve">User feedback and prioritised improvements: </w:t>
+        <w:t xml:space="preserve">Sprint/task tracking: </w:t>
       </w:r>
       <w:r>
         <w:rPr>
           <w:rFonts w:ascii="Courier New" w:hAnsi="Courier New" w:cs="Courier New"/>
         </w:rPr>
-        <w:t>Documents/User Feedback and Interview Questions.docx</w:t>
+        <w:t>Documents/CAB302 Software Project Management 389bfd0f43e648a895758d4198331dbc.csv</w:t>
       </w:r>
     </w:p>
     <w:p>
@@ -397,13 +494,13 @@
         <w:rPr>
           <w:rFonts w:ascii="Arial" w:hAnsi="Arial" w:cs="Arial"/>
         </w:rPr>
-        <w:t xml:space="preserve">Sprint/task tracking: </w:t>
+        <w:t xml:space="preserve">Commit evidence of feedback-driven fixes: </w:t>
       </w:r>
       <w:r>
         <w:rPr>
           <w:rFonts w:ascii="Courier New" w:hAnsi="Courier New" w:cs="Courier New"/>
         </w:rPr>
-        <w:t>Documents/CAB302 Software Project Management 389bfd0f43e648a895758d4198331dbc.csv</w:t>
+        <w:t>Documents/Git Commit History.txt</w:t>
       </w:r>
     </w:p>
     <w:p>
@@ -411,13 +508,27 @@
         <w:rPr>
           <w:rFonts w:ascii="Arial" w:hAnsi="Arial" w:cs="Arial"/>
         </w:rPr>
-        <w:t xml:space="preserve">Commit evidence of feedback-driven fixes: </w:t>
+        <w:t xml:space="preserve">Coverage evidence: </w:t>
       </w:r>
       <w:r>
         <w:rPr>
           <w:rFonts w:ascii="Courier New" w:hAnsi="Courier New" w:cs="Courier New"/>
         </w:rPr>
-        <w:t>Documents/Git Commit History.txt</w:t>
+        <w:t>target/site/</w:t>
+      </w:r>
+      <w:proofErr w:type="spellStart"/>
+      <w:r>
+        <w:rPr>
+          <w:rFonts w:ascii="Courier New" w:hAnsi="Courier New" w:cs="Courier New"/>
+        </w:rPr>
+        <w:t>jacoco</w:t>
+      </w:r>
+      <w:proofErr w:type="spellEnd"/>
+      <w:r>
+        <w:rPr>
+          <w:rFonts w:ascii="Courier New" w:hAnsi="Courier New" w:cs="Courier New"/>
+        </w:rPr>
+        <w:t>/index.html</w:t>
       </w:r>
     </w:p>
     <w:sectPr>
@@ -1092,7 +1203,7 @@
 </file>
 
 <file path=customXml/itemProps1.xml><?xml version="1.0" encoding="utf-8"?>
-<ds:datastoreItem xmlns:ds="http://schemas.openxmlformats.org/officeDocument/2006/customXml" ds:itemID="{82FFC6EB-48B6-2348-A55B-6C905C9496F4}">
+<ds:datastoreItem xmlns:ds="http://schemas.openxmlformats.org/officeDocument/2006/customXml" ds:itemID="{86AD6C9A-9CB7-F043-A997-B42EA3DCB354}">
   <ds:schemaRefs>
     <ds:schemaRef ds:uri="http://schemas.apple.com/cocoa/2006/metadata"/>
   </ds:schemaRefs>

</xml_diff>

<commit_message>
Changed some formatting and wording in retrospective.
</commit_message>
<xml_diff>
--- a/Documents/Sprint Retrospective - Week 13.docx
+++ b/Documents/Sprint Retrospective - Week 13.docx
@@ -3,530 +3,939 @@
 <w:document xmlns:wpc="http://schemas.microsoft.com/office/word/2010/wordprocessingCanvas" xmlns:cx="http://schemas.microsoft.com/office/drawing/2014/chartex" xmlns:cx1="http://schemas.microsoft.com/office/drawing/2015/9/8/chartex" xmlns:cx2="http://schemas.microsoft.com/office/drawing/2015/10/21/chartex" xmlns:cx3="http://schemas.microsoft.com/office/drawing/2016/5/9/chartex" xmlns:cx4="http://schemas.microsoft.com/office/drawing/2016/5/10/chartex" xmlns:cx5="http://schemas.microsoft.com/office/drawing/2016/5/11/chartex" xmlns:cx6="http://schemas.microsoft.com/office/drawing/2016/5/12/chartex" xmlns:cx7="http://schemas.microsoft.com/office/drawing/2016/5/13/chartex" xmlns:cx8="http://schemas.microsoft.com/office/drawing/2016/5/14/chartex" xmlns:mc="http://schemas.openxmlformats.org/markup-compatibility/2006" xmlns:aink="http://schemas.microsoft.com/office/drawing/2016/ink" xmlns:am3d="http://schemas.microsoft.com/office/drawing/2017/model3d" xmlns:o="urn:schemas-microsoft-com:office:office" xmlns:oel="http://schemas.microsoft.com/office/2019/extlst" xmlns:r="http://schemas.openxmlformats.org/officeDocument/2006/relationships" xmlns:m="http://schemas.openxmlformats.org/officeDocument/2006/math" xmlns:v="urn:schemas-microsoft-com:vml" xmlns:wp14="http://schemas.microsoft.com/office/word/2010/wordprocessingDrawing" xmlns:wp="http://schemas.openxmlformats.org/drawingml/2006/wordprocessingDrawing" xmlns:w10="urn:schemas-microsoft-com:office:word" xmlns:w="http://schemas.openxmlformats.org/wordprocessingml/2006/main" xmlns:w14="http://schemas.microsoft.com/office/word/2010/wordml" xmlns:w15="http://schemas.microsoft.com/office/word/2012/wordml" xmlns:w16cex="http://schemas.microsoft.com/office/word/2018/wordml/cex" xmlns:w16cid="http://schemas.microsoft.com/office/word/2016/wordml/cid" xmlns:w16="http://schemas.microsoft.com/office/word/2018/wordml" xmlns:w16du="http://schemas.microsoft.com/office/word/2023/wordml/word16du" xmlns:w16sdtdh="http://schemas.microsoft.com/office/word/2020/wordml/sdtdatahash" xmlns:w16sdtfl="http://schemas.microsoft.com/office/word/2024/wordml/sdtformatlock" xmlns:w16se="http://schemas.microsoft.com/office/word/2015/wordml/symex" xmlns:wpg="http://schemas.microsoft.com/office/word/2010/wordprocessingGroup" xmlns:wpi="http://schemas.microsoft.com/office/word/2010/wordprocessingInk" xmlns:wne="http://schemas.microsoft.com/office/word/2006/wordml" xmlns:wps="http://schemas.microsoft.com/office/word/2010/wordprocessingShape" mc:Ignorable="w14 w15 w16se w16cid w16 w16cex w16sdtdh w16sdtfl w16du wp14">
   <w:body>
     <w:p>
-      <w:r>
-        <w:rPr>
-          <w:rFonts w:ascii="Helvetica" w:hAnsi="Helvetica" w:cs="Helvetica"/>
+      <w:pPr>
+        <w:rPr>
+          <w:rFonts w:ascii="Arial" w:hAnsi="Arial" w:cs="Arial"/>
+          <w:sz w:val="20"/>
+          <w:szCs w:val="20"/>
+        </w:rPr>
+      </w:pPr>
+      <w:r>
+        <w:rPr>
+          <w:rFonts w:ascii="Arial" w:hAnsi="Arial" w:cs="Arial"/>
           <w:b/>
-          <w:sz w:val="30"/>
+          <w:sz w:val="20"/>
+          <w:szCs w:val="20"/>
         </w:rPr>
         <w:t>Sprint Retrospective - Week 13 Final Submission</w:t>
       </w:r>
     </w:p>
-    <w:p/>
-    <w:p>
-      <w:r>
-        <w:rPr>
-          <w:rFonts w:ascii="Helvetica" w:hAnsi="Helvetica" w:cs="Helvetica"/>
+    <w:p>
+      <w:pPr>
+        <w:rPr>
+          <w:rFonts w:ascii="Arial" w:hAnsi="Arial" w:cs="Arial"/>
+          <w:sz w:val="20"/>
+          <w:szCs w:val="20"/>
+        </w:rPr>
+      </w:pPr>
+      <w:r>
+        <w:rPr>
+          <w:rFonts w:ascii="Arial" w:hAnsi="Arial" w:cs="Arial"/>
           <w:b/>
+          <w:sz w:val="20"/>
+          <w:szCs w:val="20"/>
         </w:rPr>
         <w:t>Project:</w:t>
       </w:r>
       <w:r>
         <w:rPr>
-          <w:rFonts w:ascii="Helvetica" w:hAnsi="Helvetica" w:cs="Helvetica"/>
+          <w:rFonts w:ascii="Arial" w:hAnsi="Arial" w:cs="Arial"/>
           <w:b/>
+          <w:sz w:val="20"/>
+          <w:szCs w:val="20"/>
         </w:rPr>
         <w:t xml:space="preserve"> </w:t>
       </w:r>
       <w:proofErr w:type="spellStart"/>
       <w:r>
         <w:rPr>
-          <w:rFonts w:ascii="Helvetica" w:hAnsi="Helvetica" w:cs="Helvetica"/>
+          <w:rFonts w:ascii="Arial" w:hAnsi="Arial" w:cs="Arial"/>
+          <w:sz w:val="20"/>
+          <w:szCs w:val="20"/>
         </w:rPr>
         <w:t>PokerPro</w:t>
       </w:r>
       <w:proofErr w:type="spellEnd"/>
       <w:r>
         <w:rPr>
-          <w:rFonts w:ascii="Helvetica" w:hAnsi="Helvetica" w:cs="Helvetica"/>
+          <w:rFonts w:ascii="Arial" w:hAnsi="Arial" w:cs="Arial"/>
+          <w:sz w:val="20"/>
+          <w:szCs w:val="20"/>
         </w:rPr>
         <w:t>+</w:t>
       </w:r>
     </w:p>
     <w:p>
-      <w:r>
-        <w:rPr>
-          <w:rFonts w:ascii="Helvetica" w:hAnsi="Helvetica" w:cs="Helvetica"/>
+      <w:pPr>
+        <w:rPr>
+          <w:rFonts w:ascii="Arial" w:hAnsi="Arial" w:cs="Arial"/>
+          <w:sz w:val="20"/>
+          <w:szCs w:val="20"/>
+        </w:rPr>
+      </w:pPr>
+      <w:r>
+        <w:rPr>
+          <w:rFonts w:ascii="Arial" w:hAnsi="Arial" w:cs="Arial"/>
           <w:b/>
+          <w:sz w:val="20"/>
+          <w:szCs w:val="20"/>
         </w:rPr>
         <w:t>Team:</w:t>
       </w:r>
       <w:r>
         <w:rPr>
-          <w:rFonts w:ascii="Helvetica" w:hAnsi="Helvetica" w:cs="Helvetica"/>
+          <w:rFonts w:ascii="Arial" w:hAnsi="Arial" w:cs="Arial"/>
           <w:b/>
+          <w:sz w:val="20"/>
+          <w:szCs w:val="20"/>
         </w:rPr>
         <w:t xml:space="preserve"> </w:t>
       </w:r>
       <w:r>
         <w:rPr>
-          <w:rFonts w:ascii="Helvetica" w:hAnsi="Helvetica" w:cs="Helvetica"/>
+          <w:rFonts w:ascii="Arial" w:hAnsi="Arial" w:cs="Arial"/>
+          <w:sz w:val="20"/>
+          <w:szCs w:val="20"/>
         </w:rPr>
         <w:t>Gaslight</w:t>
       </w:r>
     </w:p>
     <w:p>
-      <w:r>
-        <w:rPr>
-          <w:rFonts w:ascii="Helvetica" w:hAnsi="Helvetica" w:cs="Helvetica"/>
+      <w:pPr>
+        <w:rPr>
+          <w:rFonts w:ascii="Arial" w:hAnsi="Arial" w:cs="Arial"/>
+          <w:sz w:val="20"/>
+          <w:szCs w:val="20"/>
+        </w:rPr>
+      </w:pPr>
+      <w:r>
+        <w:rPr>
+          <w:rFonts w:ascii="Arial" w:hAnsi="Arial" w:cs="Arial"/>
           <w:b/>
+          <w:sz w:val="20"/>
+          <w:szCs w:val="20"/>
         </w:rPr>
         <w:t>Retrospective Format:</w:t>
       </w:r>
       <w:r>
         <w:rPr>
-          <w:rFonts w:ascii="Helvetica" w:hAnsi="Helvetica" w:cs="Helvetica"/>
+          <w:rFonts w:ascii="Arial" w:hAnsi="Arial" w:cs="Arial"/>
+          <w:b/>
+          <w:sz w:val="20"/>
+          <w:szCs w:val="20"/>
+        </w:rPr>
+        <w:t xml:space="preserve"> </w:t>
+      </w:r>
+      <w:r>
+        <w:rPr>
+          <w:rFonts w:ascii="Arial" w:hAnsi="Arial" w:cs="Arial"/>
+          <w:sz w:val="20"/>
+          <w:szCs w:val="20"/>
         </w:rPr>
         <w:t>4Ls - Loved, Learned, Lacked, Longed For</w:t>
       </w:r>
     </w:p>
     <w:p>
-      <w:r>
-        <w:rPr>
-          <w:rFonts w:ascii="Helvetica" w:hAnsi="Helvetica" w:cs="Helvetica"/>
+      <w:pPr>
+        <w:rPr>
+          <w:rFonts w:ascii="Arial" w:hAnsi="Arial" w:cs="Arial"/>
+          <w:sz w:val="20"/>
+          <w:szCs w:val="20"/>
+        </w:rPr>
+      </w:pPr>
+      <w:r>
+        <w:rPr>
+          <w:rFonts w:ascii="Arial" w:hAnsi="Arial" w:cs="Arial"/>
           <w:b/>
+          <w:sz w:val="20"/>
+          <w:szCs w:val="20"/>
         </w:rPr>
         <w:t>Sprint Focus:</w:t>
       </w:r>
       <w:r>
         <w:rPr>
-          <w:rFonts w:ascii="Helvetica" w:hAnsi="Helvetica" w:cs="Helvetica"/>
+          <w:rFonts w:ascii="Arial" w:hAnsi="Arial" w:cs="Arial"/>
           <w:b/>
+          <w:sz w:val="20"/>
+          <w:szCs w:val="20"/>
         </w:rPr>
         <w:t xml:space="preserve"> </w:t>
       </w:r>
       <w:r>
         <w:rPr>
-          <w:rFonts w:ascii="Helvetica" w:hAnsi="Helvetica" w:cs="Helvetica"/>
+          <w:rFonts w:ascii="Arial" w:hAnsi="Arial" w:cs="Arial"/>
+          <w:sz w:val="20"/>
+          <w:szCs w:val="20"/>
         </w:rPr>
         <w:t xml:space="preserve">Final prototype completion, user feedback improvements, presentation preparation, CI, </w:t>
       </w:r>
       <w:proofErr w:type="spellStart"/>
       <w:r>
         <w:rPr>
-          <w:rFonts w:ascii="Helvetica" w:hAnsi="Helvetica" w:cs="Helvetica"/>
+          <w:rFonts w:ascii="Arial" w:hAnsi="Arial" w:cs="Arial"/>
+          <w:sz w:val="20"/>
+          <w:szCs w:val="20"/>
         </w:rPr>
         <w:t>JavaDocs</w:t>
       </w:r>
       <w:proofErr w:type="spellEnd"/>
       <w:r>
         <w:rPr>
-          <w:rFonts w:ascii="Helvetica" w:hAnsi="Helvetica" w:cs="Helvetica"/>
+          <w:rFonts w:ascii="Arial" w:hAnsi="Arial" w:cs="Arial"/>
+          <w:sz w:val="20"/>
+          <w:szCs w:val="20"/>
         </w:rPr>
         <w:t>, testing, and final submission readiness.</w:t>
       </w:r>
     </w:p>
-    <w:p/>
-    <w:p>
-      <w:r>
-        <w:rPr>
-          <w:rFonts w:ascii="Helvetica" w:hAnsi="Helvetica" w:cs="Helvetica"/>
+    <w:p>
+      <w:pPr>
+        <w:rPr>
+          <w:rFonts w:ascii="Arial" w:hAnsi="Arial" w:cs="Arial"/>
+          <w:sz w:val="20"/>
+          <w:szCs w:val="20"/>
+        </w:rPr>
+      </w:pPr>
+      <w:r>
+        <w:rPr>
+          <w:rFonts w:ascii="Arial" w:hAnsi="Arial" w:cs="Arial"/>
           <w:b/>
+          <w:sz w:val="20"/>
+          <w:szCs w:val="20"/>
         </w:rPr>
         <w:t>Purpose</w:t>
       </w:r>
     </w:p>
     <w:p>
-      <w:r>
-        <w:rPr>
-          <w:rFonts w:ascii="Helvetica" w:hAnsi="Helvetica" w:cs="Helvetica"/>
+      <w:pPr>
+        <w:rPr>
+          <w:rFonts w:ascii="Arial" w:hAnsi="Arial" w:cs="Arial"/>
+          <w:sz w:val="20"/>
+          <w:szCs w:val="20"/>
+        </w:rPr>
+      </w:pPr>
+      <w:r>
+        <w:rPr>
+          <w:rFonts w:ascii="Arial" w:hAnsi="Arial" w:cs="Arial"/>
+          <w:sz w:val="20"/>
+          <w:szCs w:val="20"/>
         </w:rPr>
         <w:t>This sprint retrospective records the team's reflection on the final phase of the project. The purpose was to review what helped the team progress, what the team learned, what was missing or weaker than expected, and what the team would change in a future sprint. This document supports the feedback-driven improvement evidence for the Week 13 final submission.</w:t>
       </w:r>
     </w:p>
-    <w:p/>
-    <w:p>
-      <w:r>
-        <w:rPr>
-          <w:rFonts w:ascii="Helvetica" w:hAnsi="Helvetica" w:cs="Helvetica"/>
+    <w:p>
+      <w:pPr>
+        <w:rPr>
+          <w:rFonts w:ascii="Arial" w:hAnsi="Arial" w:cs="Arial"/>
+          <w:sz w:val="20"/>
+          <w:szCs w:val="20"/>
+        </w:rPr>
+      </w:pPr>
+      <w:r>
+        <w:rPr>
+          <w:rFonts w:ascii="Arial" w:hAnsi="Arial" w:cs="Arial"/>
           <w:b/>
+          <w:sz w:val="20"/>
+          <w:szCs w:val="20"/>
         </w:rPr>
         <w:t>Loved</w:t>
       </w:r>
     </w:p>
     <w:p>
-      <w:r>
-        <w:rPr>
-          <w:rFonts w:ascii="Helvetica" w:hAnsi="Helvetica" w:cs="Helvetica"/>
-        </w:rPr>
-        <w:t>As a team, we were pleased with how the group came together during the final two weeks of the project. Communication became clearer and more focused, especially when coordinating final features, bug fixes, testing, documentation, and presentation responsibilities. The team used meetings and Discord communication to divide work into clear sections, which helped individual members understand what they were responsible for and how their work connected to the final submission.</w:t>
-      </w:r>
-    </w:p>
-    <w:p/>
-    <w:p>
-      <w:r>
-        <w:rPr>
-          <w:rFonts w:ascii="Helvetica" w:hAnsi="Helvetica" w:cs="Helvetica"/>
+      <w:pPr>
+        <w:rPr>
+          <w:rFonts w:ascii="Arial" w:hAnsi="Arial" w:cs="Arial"/>
+          <w:sz w:val="20"/>
+          <w:szCs w:val="20"/>
+        </w:rPr>
+      </w:pPr>
+      <w:r>
+        <w:rPr>
+          <w:rFonts w:ascii="Arial" w:hAnsi="Arial" w:cs="Arial"/>
+          <w:sz w:val="20"/>
+          <w:szCs w:val="20"/>
+        </w:rPr>
+        <w:t>As a team, we were pleased with how the group came together during the final two weeks of the project. Communication became clearer and more focused, especially when coordinating final features, bug fixes, testing, documentation, and presentation responsibilities. The team used meetings and Discord communication to divide work into clear sections, which helped individual members understand what they were responsible for and how their work connected to the final sub</w:t>
+      </w:r>
+      <w:r>
+        <w:rPr>
+          <w:rFonts w:ascii="Arial" w:hAnsi="Arial" w:cs="Arial"/>
+          <w:sz w:val="20"/>
+          <w:szCs w:val="20"/>
+        </w:rPr>
+        <w:t>m</w:t>
+      </w:r>
+      <w:r>
+        <w:rPr>
+          <w:rFonts w:ascii="Arial" w:hAnsi="Arial" w:cs="Arial"/>
+          <w:sz w:val="20"/>
+          <w:szCs w:val="20"/>
+        </w:rPr>
+        <w:t>ission.</w:t>
+      </w:r>
+    </w:p>
+    <w:p>
+      <w:pPr>
+        <w:rPr>
+          <w:rFonts w:ascii="Arial" w:hAnsi="Arial" w:cs="Arial"/>
+          <w:sz w:val="20"/>
+          <w:szCs w:val="20"/>
+        </w:rPr>
+      </w:pPr>
+      <w:r>
+        <w:rPr>
+          <w:rFonts w:ascii="Arial" w:hAnsi="Arial" w:cs="Arial"/>
+          <w:sz w:val="20"/>
+          <w:szCs w:val="20"/>
         </w:rPr>
         <w:t>We also valued that feedback from user testing was taken seriously. Issues raised by users were not ignored or treated as informal opinions. The team recorded them, prioritised them, discussed them in meetings, and converted many of them into practical changes. This included improvements to button sizing, card visibility, AI advice wording, buy-in limits, all-in behaviour, game freezes, and clearer UI behaviour.</w:t>
       </w:r>
     </w:p>
-    <w:p/>
-    <w:p>
-      <w:r>
-        <w:rPr>
-          <w:rFonts w:ascii="Helvetica" w:hAnsi="Helvetica" w:cs="Helvetica"/>
+    <w:p>
+      <w:pPr>
+        <w:rPr>
+          <w:rFonts w:ascii="Arial" w:hAnsi="Arial" w:cs="Arial"/>
+          <w:sz w:val="20"/>
+          <w:szCs w:val="20"/>
+        </w:rPr>
+      </w:pPr>
+      <w:r>
+        <w:rPr>
+          <w:rFonts w:ascii="Arial" w:hAnsi="Arial" w:cs="Arial"/>
+          <w:sz w:val="20"/>
+          <w:szCs w:val="20"/>
+        </w:rPr>
+        <w:t xml:space="preserve">Another positive outcome was that the team improved the final quality of the project through automated tests, CI setup, </w:t>
+      </w:r>
+      <w:proofErr w:type="spellStart"/>
+      <w:r>
+        <w:rPr>
+          <w:rFonts w:ascii="Arial" w:hAnsi="Arial" w:cs="Arial"/>
+          <w:sz w:val="20"/>
+          <w:szCs w:val="20"/>
+        </w:rPr>
+        <w:t>JavaDocs</w:t>
+      </w:r>
+      <w:proofErr w:type="spellEnd"/>
+      <w:r>
+        <w:rPr>
+          <w:rFonts w:ascii="Arial" w:hAnsi="Arial" w:cs="Arial"/>
+          <w:sz w:val="20"/>
+          <w:szCs w:val="20"/>
+        </w:rPr>
+        <w:t>, and repeated debugging. These practices helped make the final prototype more stable and easier for markers to assess.</w:t>
+      </w:r>
+    </w:p>
+    <w:p>
+      <w:pPr>
+        <w:rPr>
+          <w:rFonts w:ascii="Arial" w:hAnsi="Arial" w:cs="Arial"/>
+          <w:sz w:val="20"/>
+          <w:szCs w:val="20"/>
+        </w:rPr>
+      </w:pPr>
+      <w:r>
+        <w:rPr>
+          <w:rFonts w:ascii="Arial" w:hAnsi="Arial" w:cs="Arial"/>
+          <w:b/>
+          <w:sz w:val="20"/>
+          <w:szCs w:val="20"/>
+        </w:rPr>
+        <w:t>Learned</w:t>
+      </w:r>
+    </w:p>
+    <w:p>
+      <w:pPr>
+        <w:rPr>
+          <w:rFonts w:ascii="Arial" w:hAnsi="Arial" w:cs="Arial"/>
+          <w:sz w:val="20"/>
+          <w:szCs w:val="20"/>
+        </w:rPr>
+      </w:pPr>
+      <w:r>
+        <w:rPr>
+          <w:rFonts w:ascii="Arial" w:hAnsi="Arial" w:cs="Arial"/>
+          <w:sz w:val="20"/>
+          <w:szCs w:val="20"/>
+        </w:rPr>
+        <w:t>The team learned that organising work before implementation or presentation preparation makes the final output much more coherent. In the final meetings, the team identified the key assessment requirements, assigned each section to the person best suited to explain it, and agreed on how each section should connect to the others. This reduced overlap and made the scripts, slides, and walkthrough structure easier to combine.</w:t>
+      </w:r>
+    </w:p>
+    <w:p>
+      <w:pPr>
+        <w:rPr>
+          <w:rFonts w:ascii="Arial" w:hAnsi="Arial" w:cs="Arial"/>
+          <w:sz w:val="20"/>
+          <w:szCs w:val="20"/>
+        </w:rPr>
+      </w:pPr>
+      <w:r>
+        <w:rPr>
+          <w:rFonts w:ascii="Arial" w:hAnsi="Arial" w:cs="Arial"/>
+          <w:sz w:val="20"/>
+          <w:szCs w:val="20"/>
+        </w:rPr>
+        <w:t>The team also learned that user feedback is most useful when it is converted into clear, actionable items. Broad comments like "the game feels confusing" or "the app looks frozen" became more useful once they were broken down into specific issues such as unclear turn status, delayed action log updates, missing AI loading/error feedback, or inconsistent button sizes. This made it easier to decide which issues were high priority and which were outside the current project scope.</w:t>
+      </w:r>
+    </w:p>
+    <w:p>
+      <w:pPr>
+        <w:rPr>
+          <w:rFonts w:ascii="Arial" w:hAnsi="Arial" w:cs="Arial"/>
+          <w:sz w:val="20"/>
+          <w:szCs w:val="20"/>
+        </w:rPr>
+      </w:pPr>
+      <w:r>
+        <w:rPr>
+          <w:rFonts w:ascii="Arial" w:hAnsi="Arial" w:cs="Arial"/>
+          <w:sz w:val="20"/>
+          <w:szCs w:val="20"/>
+        </w:rPr>
+        <w:t xml:space="preserve">A further lesson was that technical improvements and UX improvements are connected. Fixing all-in logic, pot logic, AI fallback behaviour, database null pointer errors, and betting loops did not </w:t>
+      </w:r>
+      <w:r>
+        <w:rPr>
+          <w:rFonts w:ascii="Arial" w:hAnsi="Arial" w:cs="Arial"/>
+          <w:sz w:val="20"/>
+          <w:szCs w:val="20"/>
         </w:rPr>
         <w:lastRenderedPageBreak/>
-        <w:t xml:space="preserve">Another positive outcome was that the team improved the final quality of the project through automated tests, CI setup, </w:t>
+        <w:t>only improve code quality. It also improved the user experience because the application became more predictable and less likely to freeze during normal play.</w:t>
+      </w:r>
+    </w:p>
+    <w:p>
+      <w:pPr>
+        <w:rPr>
+          <w:rFonts w:ascii="Arial" w:hAnsi="Arial" w:cs="Arial"/>
+          <w:sz w:val="20"/>
+          <w:szCs w:val="20"/>
+        </w:rPr>
+      </w:pPr>
+      <w:r>
+        <w:rPr>
+          <w:rFonts w:ascii="Arial" w:hAnsi="Arial" w:cs="Arial"/>
+          <w:sz w:val="20"/>
+          <w:szCs w:val="20"/>
+        </w:rPr>
+        <w:t xml:space="preserve">The team also learned from the final </w:t>
       </w:r>
       <w:proofErr w:type="spellStart"/>
       <w:r>
         <w:rPr>
-          <w:rFonts w:ascii="Helvetica" w:hAnsi="Helvetica" w:cs="Helvetica"/>
-        </w:rPr>
-        <w:t>JavaDocs</w:t>
+          <w:rFonts w:ascii="Arial" w:hAnsi="Arial" w:cs="Arial"/>
+          <w:sz w:val="20"/>
+          <w:szCs w:val="20"/>
+        </w:rPr>
+        <w:t>JaCoCo</w:t>
       </w:r>
       <w:proofErr w:type="spellEnd"/>
       <w:r>
         <w:rPr>
-          <w:rFonts w:ascii="Helvetica" w:hAnsi="Helvetica" w:cs="Helvetica"/>
-        </w:rPr>
-        <w:t>, and repeated debugging. These practices helped make the final prototype more stable and easier for markers to assess.</w:t>
-      </w:r>
-    </w:p>
-    <w:p/>
-    <w:p>
-      <w:r>
-        <w:rPr>
-          <w:rFonts w:ascii="Helvetica" w:hAnsi="Helvetica" w:cs="Helvetica"/>
+          <w:rFonts w:ascii="Arial" w:hAnsi="Arial" w:cs="Arial"/>
+          <w:sz w:val="20"/>
+          <w:szCs w:val="20"/>
+        </w:rPr>
+        <w:t xml:space="preserve"> coverage report. The core backend and game-logic packages had stronger coverage than the overall project average, but JavaFX controller coverage was low. This showed that our automated testing was strongest around high-risk model, database, and service logic, while UI controller behaviour was mostly validated through usability testing and manual walkthroughs.</w:t>
+      </w:r>
+    </w:p>
+    <w:p>
+      <w:pPr>
+        <w:rPr>
+          <w:rFonts w:ascii="Arial" w:hAnsi="Arial" w:cs="Arial"/>
+          <w:sz w:val="20"/>
+          <w:szCs w:val="20"/>
+        </w:rPr>
+      </w:pPr>
+      <w:r>
+        <w:rPr>
+          <w:rFonts w:ascii="Arial" w:hAnsi="Arial" w:cs="Arial"/>
           <w:b/>
-        </w:rPr>
-        <w:t>Learned</w:t>
-      </w:r>
-    </w:p>
-    <w:p>
-      <w:r>
-        <w:rPr>
-          <w:rFonts w:ascii="Helvetica" w:hAnsi="Helvetica" w:cs="Helvetica"/>
-        </w:rPr>
-        <w:t>The team learned that organising work before implementation or presentation preparation makes the final output much more coherent. In the final meetings, the team identified the key assessment requirements, assigned each section to the person best suited to explain it, and agreed on how each section should connect to the others. This reduced overlap and made the scripts, slides, and walkthrough structure easier to combine.</w:t>
-      </w:r>
-    </w:p>
-    <w:p/>
-    <w:p>
-      <w:r>
-        <w:rPr>
-          <w:rFonts w:ascii="Helvetica" w:hAnsi="Helvetica" w:cs="Helvetica"/>
-        </w:rPr>
-        <w:t>The team also learned that user feedback is most useful when it is converted into clear, actionable items. Broad comments like "the game feels confusing" or "the app looks frozen" became more useful once they were broken down into specific issues such as unclear turn status, delayed action log updates, missing AI loading/error feedback, or inconsistent button sizes. This made it easier to decide which issues were high priority and which were outside the current project scope.</w:t>
-      </w:r>
-    </w:p>
-    <w:p/>
-    <w:p>
-      <w:r>
-        <w:rPr>
-          <w:rFonts w:ascii="Helvetica" w:hAnsi="Helvetica" w:cs="Helvetica"/>
-        </w:rPr>
-        <w:t>A further lesson was that technical improvements and UX improvements are connected. Fixing all-in logic, pot logic, AI fallback behaviour, database null pointer errors, and betting loops did not only improve code quality. It also improved the user experience because the application became more predictable and less likely to freeze during normal play.</w:t>
-      </w:r>
-    </w:p>
-    <w:p/>
-    <w:p>
-      <w:r>
-        <w:rPr>
-          <w:rFonts w:ascii="Helvetica" w:hAnsi="Helvetica" w:cs="Helvetica"/>
-        </w:rPr>
-        <w:t xml:space="preserve">The team also learned from the final </w:t>
+          <w:sz w:val="20"/>
+          <w:szCs w:val="20"/>
+        </w:rPr>
+        <w:t>Lacked</w:t>
+      </w:r>
+    </w:p>
+    <w:p>
+      <w:pPr>
+        <w:rPr>
+          <w:rFonts w:ascii="Arial" w:hAnsi="Arial" w:cs="Arial"/>
+          <w:sz w:val="20"/>
+          <w:szCs w:val="20"/>
+        </w:rPr>
+      </w:pPr>
+      <w:r>
+        <w:rPr>
+          <w:rFonts w:ascii="Arial" w:hAnsi="Arial" w:cs="Arial"/>
+          <w:sz w:val="20"/>
+          <w:szCs w:val="20"/>
+        </w:rPr>
+        <w:t>The main weakness in this sprint was time management. Although the team completed the final submission work, some tasks could have been started earlier. This reduced the amount of time available for group rehearsal, final polish, and deeper review of the presentation flow. The final product was still completed, but the team recognised that earlier script preparation and earlier consolidation of evidence would have reduced pressure near the deadline.</w:t>
+      </w:r>
+    </w:p>
+    <w:p>
+      <w:pPr>
+        <w:rPr>
+          <w:rFonts w:ascii="Arial" w:hAnsi="Arial" w:cs="Arial"/>
+          <w:sz w:val="20"/>
+          <w:szCs w:val="20"/>
+        </w:rPr>
+      </w:pPr>
+      <w:r>
+        <w:rPr>
+          <w:rFonts w:ascii="Arial" w:hAnsi="Arial" w:cs="Arial"/>
+          <w:sz w:val="20"/>
+          <w:szCs w:val="20"/>
+        </w:rPr>
+        <w:t>The team also lacked a separate retrospective document before this final stage. Reflection was happening in meetings and was recorded in the meeting journal, especially around user testing, bug fixing, CI, and presentation preparation, but it was not separated into a dedicated retrospective artefact. Creating this document makes that reflective practice easier for markers to locate and verify.</w:t>
+      </w:r>
+    </w:p>
+    <w:p>
+      <w:pPr>
+        <w:rPr>
+          <w:rFonts w:ascii="Arial" w:hAnsi="Arial" w:cs="Arial"/>
+          <w:sz w:val="20"/>
+          <w:szCs w:val="20"/>
+        </w:rPr>
+      </w:pPr>
+      <w:r>
+        <w:rPr>
+          <w:rFonts w:ascii="Arial" w:hAnsi="Arial" w:cs="Arial"/>
+          <w:sz w:val="20"/>
+          <w:szCs w:val="20"/>
+        </w:rPr>
+        <w:t>Another limitation was that some feedback items could not be fully resolved within scope. Examples include password recovery, guest login, fully scalable poker table layout, and some improvements to opponent chip/status communication. These were recorded and discussed, but the team had to prioritise must-have requirements, stability, and assessment deliverables.</w:t>
+      </w:r>
+    </w:p>
+    <w:p>
+      <w:pPr>
+        <w:rPr>
+          <w:rFonts w:ascii="Arial" w:hAnsi="Arial" w:cs="Arial"/>
+          <w:sz w:val="20"/>
+          <w:szCs w:val="20"/>
+        </w:rPr>
+      </w:pPr>
+      <w:r>
+        <w:rPr>
+          <w:rFonts w:ascii="Arial" w:hAnsi="Arial" w:cs="Arial"/>
+          <w:sz w:val="20"/>
+          <w:szCs w:val="20"/>
+        </w:rPr>
+        <w:t>The team also lacked automated coverage for JavaFX controller behaviour. This did not mean UI quality was ignored, because UI quality was assessed through user testing and manual validation, but it does show a clear future improvement area for automated quality assurance.</w:t>
+      </w:r>
+    </w:p>
+    <w:p>
+      <w:pPr>
+        <w:rPr>
+          <w:rFonts w:ascii="Arial" w:hAnsi="Arial" w:cs="Arial"/>
+          <w:sz w:val="20"/>
+          <w:szCs w:val="20"/>
+        </w:rPr>
+      </w:pPr>
+      <w:r>
+        <w:rPr>
+          <w:rFonts w:ascii="Arial" w:hAnsi="Arial" w:cs="Arial"/>
+          <w:b/>
+          <w:sz w:val="20"/>
+          <w:szCs w:val="20"/>
+        </w:rPr>
+        <w:t>Longed For</w:t>
+      </w:r>
+    </w:p>
+    <w:p>
+      <w:pPr>
+        <w:rPr>
+          <w:rFonts w:ascii="Arial" w:hAnsi="Arial" w:cs="Arial"/>
+          <w:sz w:val="20"/>
+          <w:szCs w:val="20"/>
+        </w:rPr>
+      </w:pPr>
+      <w:r>
+        <w:rPr>
+          <w:rFonts w:ascii="Arial" w:hAnsi="Arial" w:cs="Arial"/>
+          <w:sz w:val="20"/>
+          <w:szCs w:val="20"/>
+        </w:rPr>
+        <w:t>In a future sprint, the team would aim to start presentation and final evidence preparation earlier. This would allow more time for rehearsal, editing, and checking that every claim in the video has a matching artefact in the zip file.</w:t>
+      </w:r>
+    </w:p>
+    <w:p>
+      <w:pPr>
+        <w:rPr>
+          <w:rFonts w:ascii="Arial" w:hAnsi="Arial" w:cs="Arial"/>
+          <w:sz w:val="20"/>
+          <w:szCs w:val="20"/>
+        </w:rPr>
+      </w:pPr>
+      <w:r>
+        <w:rPr>
+          <w:rFonts w:ascii="Arial" w:hAnsi="Arial" w:cs="Arial"/>
+          <w:sz w:val="20"/>
+          <w:szCs w:val="20"/>
+        </w:rPr>
+        <w:t>The team would also improve communication around blockers. When a member is delayed or unsure whether a task will be finished on time, the team should raise that earlier so the workload can be adjusted. This would create more realistic expectations and reduce last-minute pressure.</w:t>
+      </w:r>
+    </w:p>
+    <w:p>
+      <w:pPr>
+        <w:rPr>
+          <w:rFonts w:ascii="Arial" w:hAnsi="Arial" w:cs="Arial"/>
+          <w:sz w:val="20"/>
+          <w:szCs w:val="20"/>
+        </w:rPr>
+      </w:pPr>
+      <w:r>
+        <w:rPr>
+          <w:rFonts w:ascii="Arial" w:hAnsi="Arial" w:cs="Arial"/>
+          <w:sz w:val="20"/>
+          <w:szCs w:val="20"/>
+        </w:rPr>
+        <w:t>The team would also like to continue improving the product by focusing on unresolved UX concerns. The highest-value future improvements would be clearer AI thinking/loading feedback, better opponent status communication, improved accessibility for visually impaired users, and a more scalable game interface.</w:t>
+      </w:r>
+    </w:p>
+    <w:p>
+      <w:pPr>
+        <w:rPr>
+          <w:rFonts w:ascii="Arial" w:hAnsi="Arial" w:cs="Arial"/>
+          <w:sz w:val="20"/>
+          <w:szCs w:val="20"/>
+        </w:rPr>
+      </w:pPr>
+    </w:p>
+    <w:p>
+      <w:pPr>
+        <w:rPr>
+          <w:rFonts w:ascii="Arial" w:hAnsi="Arial" w:cs="Arial"/>
+          <w:sz w:val="20"/>
+          <w:szCs w:val="20"/>
+        </w:rPr>
+      </w:pPr>
+      <w:r>
+        <w:rPr>
+          <w:rFonts w:ascii="Arial" w:hAnsi="Arial" w:cs="Arial"/>
+          <w:sz w:val="20"/>
+          <w:szCs w:val="20"/>
+        </w:rPr>
+        <w:t xml:space="preserve">The team would also improve automated quality assessment by adding controller-level or </w:t>
       </w:r>
       <w:proofErr w:type="spellStart"/>
       <w:r>
         <w:rPr>
-          <w:rFonts w:ascii="Helvetica" w:hAnsi="Helvetica" w:cs="Helvetica"/>
-        </w:rPr>
-        <w:t>JaCoCo</w:t>
+          <w:rFonts w:ascii="Arial" w:hAnsi="Arial" w:cs="Arial"/>
+          <w:sz w:val="20"/>
+          <w:szCs w:val="20"/>
+        </w:rPr>
+        <w:t>TestFX</w:t>
       </w:r>
       <w:proofErr w:type="spellEnd"/>
       <w:r>
         <w:rPr>
-          <w:rFonts w:ascii="Helvetica" w:hAnsi="Helvetica" w:cs="Helvetica"/>
-        </w:rPr>
-        <w:t xml:space="preserve"> coverage report. The core backend and game-logic packages had stronger coverage than the overall project average, but JavaFX controller coverage was low. This showed that our automated testing was strongest around high-risk model, database, and service logic, while UI controller behaviour was mostly validated through usability testing and manual walkthroughs.</w:t>
-      </w:r>
-    </w:p>
-    <w:p/>
-    <w:p>
-      <w:r>
-        <w:rPr>
-          <w:rFonts w:ascii="Helvetica" w:hAnsi="Helvetica" w:cs="Helvetica"/>
+          <w:rFonts w:ascii="Arial" w:hAnsi="Arial" w:cs="Arial"/>
+          <w:sz w:val="20"/>
+          <w:szCs w:val="20"/>
+        </w:rPr>
+        <w:t xml:space="preserve"> tests for JavaFX UI behaviour, and by mocking AI HTTP responses so AI-related tests can run reliably without a live API key.</w:t>
+      </w:r>
+    </w:p>
+    <w:p>
+      <w:pPr>
+        <w:rPr>
+          <w:rFonts w:ascii="Arial" w:hAnsi="Arial" w:cs="Arial"/>
+          <w:sz w:val="20"/>
+          <w:szCs w:val="20"/>
+        </w:rPr>
+      </w:pPr>
+    </w:p>
+    <w:p>
+      <w:pPr>
+        <w:rPr>
+          <w:rFonts w:ascii="Arial" w:hAnsi="Arial" w:cs="Arial"/>
+          <w:sz w:val="20"/>
+          <w:szCs w:val="20"/>
+        </w:rPr>
+      </w:pPr>
+      <w:r>
+        <w:rPr>
+          <w:rFonts w:ascii="Arial" w:hAnsi="Arial" w:cs="Arial"/>
           <w:b/>
-        </w:rPr>
-        <w:lastRenderedPageBreak/>
-        <w:t>Lacked</w:t>
-      </w:r>
-    </w:p>
-    <w:p>
-      <w:r>
-        <w:rPr>
-          <w:rFonts w:ascii="Helvetica" w:hAnsi="Helvetica" w:cs="Helvetica"/>
-        </w:rPr>
-        <w:t>The main weakness in this sprint was time management. Although the team completed the final submission work, some tasks could have been started earlier. This reduced the amount of time available for group rehearsal, final polish, and deeper review of the presentation flow. The final product was still completed, but the team recognised that earlier script preparation and earlier consolidation of evidence would have reduced pressure near the deadline.</w:t>
-      </w:r>
-    </w:p>
-    <w:p/>
-    <w:p>
-      <w:r>
-        <w:rPr>
-          <w:rFonts w:ascii="Helvetica" w:hAnsi="Helvetica" w:cs="Helvetica"/>
-        </w:rPr>
-        <w:t>The team also lacked a separate retrospective document before this final stage. Reflection was happening in meetings and was recorded in the meeting journal, especially around user testing, bug fixing, CI, and presentation preparation, but it was not separated into a dedicated retrospective artefact. Creating this document makes that reflective practice easier for markers to locate and verify.</w:t>
-      </w:r>
-    </w:p>
-    <w:p/>
-    <w:p>
-      <w:r>
-        <w:rPr>
-          <w:rFonts w:ascii="Helvetica" w:hAnsi="Helvetica" w:cs="Helvetica"/>
-        </w:rPr>
-        <w:t>Another limitation was that some feedback items could not be fully resolved within scope. Examples include password recovery, guest login, fully scalable poker table layout, and some improvements to opponent chip/status communication. These were recorded and discussed, but the team had to prioritise must-have requirements, stability, and assessment deliverables.</w:t>
-      </w:r>
-    </w:p>
-    <w:p/>
-    <w:p>
-      <w:r>
-        <w:rPr>
-          <w:rFonts w:ascii="Helvetica" w:hAnsi="Helvetica" w:cs="Helvetica"/>
-        </w:rPr>
-        <w:t>The team also lacked automated coverage for JavaFX controller behaviour. This did not mean UI quality was ignored, because UI quality was assessed through user testing and manual validation, but it does show a clear future improvement area for automated quality assurance.</w:t>
-      </w:r>
-    </w:p>
-    <w:p/>
-    <w:p>
-      <w:r>
-        <w:rPr>
-          <w:rFonts w:ascii="Helvetica" w:hAnsi="Helvetica" w:cs="Helvetica"/>
+          <w:sz w:val="20"/>
+          <w:szCs w:val="20"/>
+        </w:rPr>
+        <w:t>Actions For Future Improvement</w:t>
+      </w:r>
+    </w:p>
+    <w:p>
+      <w:pPr>
+        <w:rPr>
+          <w:rFonts w:ascii="Arial" w:hAnsi="Arial" w:cs="Arial"/>
+          <w:sz w:val="20"/>
+          <w:szCs w:val="20"/>
+        </w:rPr>
+      </w:pPr>
+      <w:r>
+        <w:rPr>
+          <w:rFonts w:ascii="Arial" w:hAnsi="Arial" w:cs="Arial"/>
+          <w:sz w:val="20"/>
+          <w:szCs w:val="20"/>
+        </w:rPr>
+        <w:t xml:space="preserve">1. </w:t>
+      </w:r>
+      <w:r>
+        <w:rPr>
+          <w:rFonts w:ascii="Arial" w:hAnsi="Arial" w:cs="Arial"/>
+          <w:sz w:val="20"/>
+          <w:szCs w:val="20"/>
+        </w:rPr>
+        <w:t>Start final presentation scripting and evidence collection earlier in the sprint.</w:t>
+      </w:r>
+    </w:p>
+    <w:p>
+      <w:pPr>
+        <w:rPr>
+          <w:rFonts w:ascii="Arial" w:hAnsi="Arial" w:cs="Arial"/>
+          <w:sz w:val="20"/>
+          <w:szCs w:val="20"/>
+        </w:rPr>
+      </w:pPr>
+      <w:r>
+        <w:rPr>
+          <w:rFonts w:ascii="Arial" w:hAnsi="Arial" w:cs="Arial"/>
+          <w:sz w:val="20"/>
+          <w:szCs w:val="20"/>
+        </w:rPr>
+        <w:t>2. Keep a dedicated retrospective document after each major sprint instead of relying only on meeting notes.</w:t>
+      </w:r>
+    </w:p>
+    <w:p>
+      <w:pPr>
+        <w:rPr>
+          <w:rFonts w:ascii="Arial" w:hAnsi="Arial" w:cs="Arial"/>
+          <w:sz w:val="20"/>
+          <w:szCs w:val="20"/>
+        </w:rPr>
+      </w:pPr>
+      <w:r>
+        <w:rPr>
+          <w:rFonts w:ascii="Arial" w:hAnsi="Arial" w:cs="Arial"/>
+          <w:sz w:val="20"/>
+          <w:szCs w:val="20"/>
+        </w:rPr>
+        <w:t>3. Convert user feedback into prioritised action items immediately after testing.</w:t>
+      </w:r>
+    </w:p>
+    <w:p>
+      <w:pPr>
+        <w:rPr>
+          <w:rFonts w:ascii="Arial" w:hAnsi="Arial" w:cs="Arial"/>
+          <w:sz w:val="20"/>
+          <w:szCs w:val="20"/>
+        </w:rPr>
+      </w:pPr>
+      <w:r>
+        <w:rPr>
+          <w:rFonts w:ascii="Arial" w:hAnsi="Arial" w:cs="Arial"/>
+          <w:sz w:val="20"/>
+          <w:szCs w:val="20"/>
+        </w:rPr>
+        <w:t>4. Raise blockers earlier so tasks can be reassigned or reduced in scope before they affect the team timeline.</w:t>
+      </w:r>
+    </w:p>
+    <w:p>
+      <w:pPr>
+        <w:rPr>
+          <w:rFonts w:ascii="Arial" w:hAnsi="Arial" w:cs="Arial"/>
+          <w:sz w:val="20"/>
+          <w:szCs w:val="20"/>
+        </w:rPr>
+      </w:pPr>
+      <w:r>
+        <w:rPr>
+          <w:rFonts w:ascii="Arial" w:hAnsi="Arial" w:cs="Arial"/>
+          <w:sz w:val="20"/>
+          <w:szCs w:val="20"/>
+        </w:rPr>
+        <w:t>5. Continue linking each quality improvement to tests, commits, or project management artefacts so evidence is easy for markers to verify.</w:t>
+      </w:r>
+    </w:p>
+    <w:p>
+      <w:pPr>
+        <w:rPr>
+          <w:rFonts w:ascii="Arial" w:hAnsi="Arial" w:cs="Arial"/>
+          <w:sz w:val="20"/>
+          <w:szCs w:val="20"/>
+        </w:rPr>
+      </w:pPr>
+      <w:r>
+        <w:rPr>
+          <w:rFonts w:ascii="Arial" w:hAnsi="Arial" w:cs="Arial"/>
+          <w:sz w:val="20"/>
+          <w:szCs w:val="20"/>
+        </w:rPr>
+        <w:t xml:space="preserve">6. Add controller-level or </w:t>
+      </w:r>
+      <w:proofErr w:type="spellStart"/>
+      <w:r>
+        <w:rPr>
+          <w:rFonts w:ascii="Arial" w:hAnsi="Arial" w:cs="Arial"/>
+          <w:sz w:val="20"/>
+          <w:szCs w:val="20"/>
+        </w:rPr>
+        <w:t>TestFX</w:t>
+      </w:r>
+      <w:proofErr w:type="spellEnd"/>
+      <w:r>
+        <w:rPr>
+          <w:rFonts w:ascii="Arial" w:hAnsi="Arial" w:cs="Arial"/>
+          <w:sz w:val="20"/>
+          <w:szCs w:val="20"/>
+        </w:rPr>
+        <w:t xml:space="preserve"> tests to improve automated coverage of JavaFX UI behaviour.</w:t>
+      </w:r>
+    </w:p>
+    <w:p>
+      <w:pPr>
+        <w:rPr>
+          <w:rFonts w:ascii="Arial" w:hAnsi="Arial" w:cs="Arial"/>
+          <w:sz w:val="20"/>
+          <w:szCs w:val="20"/>
+        </w:rPr>
+      </w:pPr>
+      <w:r>
+        <w:rPr>
+          <w:rFonts w:ascii="Arial" w:hAnsi="Arial" w:cs="Arial"/>
+          <w:sz w:val="20"/>
+          <w:szCs w:val="20"/>
+        </w:rPr>
+        <w:t>7. Mock AI HTTP/API responses in tests so AI reliability can be assessed without depending on a live API key or network access.</w:t>
+      </w:r>
+    </w:p>
+    <w:p>
+      <w:pPr>
+        <w:rPr>
+          <w:rFonts w:ascii="Arial" w:hAnsi="Arial" w:cs="Arial"/>
+          <w:sz w:val="20"/>
+          <w:szCs w:val="20"/>
+        </w:rPr>
+      </w:pPr>
+    </w:p>
+    <w:p>
+      <w:pPr>
+        <w:rPr>
+          <w:rFonts w:ascii="Arial" w:hAnsi="Arial" w:cs="Arial"/>
+          <w:sz w:val="20"/>
+          <w:szCs w:val="20"/>
+        </w:rPr>
+      </w:pPr>
+      <w:r>
+        <w:rPr>
+          <w:rFonts w:ascii="Arial" w:hAnsi="Arial" w:cs="Arial"/>
           <w:b/>
-        </w:rPr>
-        <w:t>Longed For</w:t>
-      </w:r>
-    </w:p>
-    <w:p>
-      <w:r>
-        <w:rPr>
-          <w:rFonts w:ascii="Helvetica" w:hAnsi="Helvetica" w:cs="Helvetica"/>
-        </w:rPr>
-        <w:t>In a future sprint, the team would aim to start presentation and final evidence preparation earlier. This would allow more time for rehearsal, editing, and checking that every claim in the video has a matching artefact in the zip file.</w:t>
-      </w:r>
-    </w:p>
-    <w:p/>
-    <w:p>
-      <w:r>
-        <w:rPr>
-          <w:rFonts w:ascii="Helvetica" w:hAnsi="Helvetica" w:cs="Helvetica"/>
-        </w:rPr>
-        <w:t xml:space="preserve">The team would also improve communication around blockers. When a member is delayed or unsure whether a task will be finished on time, the team should </w:t>
-      </w:r>
-      <w:r>
-        <w:rPr>
-          <w:rFonts w:ascii="Helvetica" w:hAnsi="Helvetica" w:cs="Helvetica"/>
-        </w:rPr>
-        <w:lastRenderedPageBreak/>
-        <w:t>raise that earlier so the workload can be adjusted. This would create more realistic expectations and reduce last-minute pressure.</w:t>
-      </w:r>
-    </w:p>
-    <w:p/>
-    <w:p>
-      <w:r>
-        <w:rPr>
-          <w:rFonts w:ascii="Helvetica" w:hAnsi="Helvetica" w:cs="Helvetica"/>
-        </w:rPr>
-        <w:t>The team would also like to continue improving the product by focusing on unresolved UX concerns. The highest-value future improvements would be clearer AI thinking/loading feedback, better opponent status communication, improved accessibility for visually impaired users, and a more scalable game interface.</w:t>
-      </w:r>
-    </w:p>
-    <w:p/>
-    <w:p>
-      <w:r>
-        <w:rPr>
-          <w:rFonts w:ascii="Helvetica" w:hAnsi="Helvetica" w:cs="Helvetica"/>
-        </w:rPr>
-        <w:t xml:space="preserve">The team would also improve automated quality assessment by adding controller-level or </w:t>
+          <w:sz w:val="20"/>
+          <w:szCs w:val="20"/>
+        </w:rPr>
+        <w:t>Evidence Links</w:t>
+      </w:r>
+    </w:p>
+    <w:p>
+      <w:pPr>
+        <w:rPr>
+          <w:rFonts w:ascii="Arial" w:hAnsi="Arial" w:cs="Arial"/>
+          <w:sz w:val="20"/>
+          <w:szCs w:val="20"/>
+        </w:rPr>
+      </w:pPr>
+      <w:r>
+        <w:rPr>
+          <w:rFonts w:ascii="Arial" w:hAnsi="Arial" w:cs="Arial"/>
+          <w:sz w:val="20"/>
+          <w:szCs w:val="20"/>
+        </w:rPr>
+        <w:t>Meeting notes and reflective discussion: Documents/Meetings Journal</w:t>
+      </w:r>
+    </w:p>
+    <w:p>
+      <w:pPr>
+        <w:rPr>
+          <w:rFonts w:ascii="Arial" w:hAnsi="Arial" w:cs="Arial"/>
+          <w:sz w:val="20"/>
+          <w:szCs w:val="20"/>
+        </w:rPr>
+      </w:pPr>
+      <w:r>
+        <w:rPr>
+          <w:rFonts w:ascii="Arial" w:hAnsi="Arial" w:cs="Arial"/>
+          <w:sz w:val="20"/>
+          <w:szCs w:val="20"/>
+        </w:rPr>
+        <w:t>User feedback and prioritised improvements: Documents/User Feedback and Interview Questions.docx</w:t>
+      </w:r>
+    </w:p>
+    <w:p>
+      <w:pPr>
+        <w:rPr>
+          <w:rFonts w:ascii="Arial" w:hAnsi="Arial" w:cs="Arial"/>
+          <w:sz w:val="20"/>
+          <w:szCs w:val="20"/>
+        </w:rPr>
+      </w:pPr>
+      <w:r>
+        <w:rPr>
+          <w:rFonts w:ascii="Arial" w:hAnsi="Arial" w:cs="Arial"/>
+          <w:sz w:val="20"/>
+          <w:szCs w:val="20"/>
+        </w:rPr>
+        <w:t>Sprint/task tracking: Documents/CAB302 Software Project Management 389bfd0f43e648a895758d4198331dbc.csv</w:t>
+      </w:r>
+    </w:p>
+    <w:p>
+      <w:pPr>
+        <w:rPr>
+          <w:rFonts w:ascii="Arial" w:hAnsi="Arial" w:cs="Arial"/>
+          <w:sz w:val="20"/>
+          <w:szCs w:val="20"/>
+        </w:rPr>
+      </w:pPr>
+      <w:r>
+        <w:rPr>
+          <w:rFonts w:ascii="Arial" w:hAnsi="Arial" w:cs="Arial"/>
+          <w:sz w:val="20"/>
+          <w:szCs w:val="20"/>
+        </w:rPr>
+        <w:t>Commit evidence of feedback-driven fixes: Documents/Git Commit History.txt</w:t>
+      </w:r>
+    </w:p>
+    <w:p>
+      <w:pPr>
+        <w:rPr>
+          <w:rFonts w:ascii="Arial" w:hAnsi="Arial" w:cs="Arial"/>
+          <w:sz w:val="20"/>
+          <w:szCs w:val="20"/>
+        </w:rPr>
+      </w:pPr>
+      <w:r>
+        <w:rPr>
+          <w:rFonts w:ascii="Arial" w:hAnsi="Arial" w:cs="Arial"/>
+          <w:sz w:val="20"/>
+          <w:szCs w:val="20"/>
+        </w:rPr>
+        <w:t>Coverage evidence: target/site/</w:t>
       </w:r>
       <w:proofErr w:type="spellStart"/>
       <w:r>
         <w:rPr>
-          <w:rFonts w:ascii="Helvetica" w:hAnsi="Helvetica" w:cs="Helvetica"/>
-        </w:rPr>
-        <w:t>TestFX</w:t>
+          <w:rFonts w:ascii="Arial" w:hAnsi="Arial" w:cs="Arial"/>
+          <w:sz w:val="20"/>
+          <w:szCs w:val="20"/>
+        </w:rPr>
+        <w:t>jacoco</w:t>
       </w:r>
       <w:proofErr w:type="spellEnd"/>
       <w:r>
         <w:rPr>
-          <w:rFonts w:ascii="Helvetica" w:hAnsi="Helvetica" w:cs="Helvetica"/>
-        </w:rPr>
-        <w:t xml:space="preserve"> tests for JavaFX UI behaviour, and by mocking AI HTTP responses so AI-related tests can run reliably without a live API key.</w:t>
-      </w:r>
-    </w:p>
-    <w:p/>
-    <w:p>
-      <w:r>
-        <w:rPr>
-          <w:rFonts w:ascii="Helvetica" w:hAnsi="Helvetica" w:cs="Helvetica"/>
-          <w:b/>
-        </w:rPr>
-        <w:t>Actions For Future Improvement</w:t>
-      </w:r>
-    </w:p>
-    <w:p>
-      <w:r>
-        <w:rPr>
-          <w:rFonts w:ascii="Helvetica" w:hAnsi="Helvetica" w:cs="Helvetica"/>
-        </w:rPr>
-        <w:t>1. Start final presentation scripting and evidence collection earlier in the sprint.</w:t>
-      </w:r>
-    </w:p>
-    <w:p>
-      <w:r>
-        <w:rPr>
-          <w:rFonts w:ascii="Helvetica" w:hAnsi="Helvetica" w:cs="Helvetica"/>
-        </w:rPr>
-        <w:t>2. Keep a dedicated retrospective document after each major sprint instead of relying only on meeting notes.</w:t>
-      </w:r>
-    </w:p>
-    <w:p>
-      <w:r>
-        <w:rPr>
-          <w:rFonts w:ascii="Helvetica" w:hAnsi="Helvetica" w:cs="Helvetica"/>
-        </w:rPr>
-        <w:t>3. Convert user feedback into prioritised action items immediately after testing.</w:t>
-      </w:r>
-    </w:p>
-    <w:p>
-      <w:r>
-        <w:rPr>
-          <w:rFonts w:ascii="Helvetica" w:hAnsi="Helvetica" w:cs="Helvetica"/>
-        </w:rPr>
-        <w:t>4. Raise blockers earlier so tasks can be reassigned or reduced in scope before they affect the team timeline.</w:t>
-      </w:r>
-    </w:p>
-    <w:p>
-      <w:r>
-        <w:rPr>
-          <w:rFonts w:ascii="Helvetica" w:hAnsi="Helvetica" w:cs="Helvetica"/>
-        </w:rPr>
-        <w:t>5. Continue linking each quality improvement to tests, commits, or project management artefacts so evidence is easy for markers to verify.</w:t>
-      </w:r>
-    </w:p>
-    <w:p>
-      <w:r>
-        <w:rPr>
-          <w:rFonts w:ascii="Helvetica" w:hAnsi="Helvetica" w:cs="Helvetica"/>
-        </w:rPr>
-        <w:t xml:space="preserve">6. Add controller-level or </w:t>
-      </w:r>
-      <w:proofErr w:type="spellStart"/>
-      <w:r>
-        <w:rPr>
-          <w:rFonts w:ascii="Helvetica" w:hAnsi="Helvetica" w:cs="Helvetica"/>
-        </w:rPr>
-        <w:t>TestFX</w:t>
-      </w:r>
-      <w:proofErr w:type="spellEnd"/>
-      <w:r>
-        <w:rPr>
-          <w:rFonts w:ascii="Helvetica" w:hAnsi="Helvetica" w:cs="Helvetica"/>
-        </w:rPr>
-        <w:t xml:space="preserve"> tests to improve automated coverage of JavaFX UI behaviour.</w:t>
-      </w:r>
-    </w:p>
-    <w:p>
-      <w:r>
-        <w:rPr>
-          <w:rFonts w:ascii="Helvetica" w:hAnsi="Helvetica" w:cs="Helvetica"/>
-        </w:rPr>
-        <w:t>7. Mock AI HTTP/API responses in tests so AI reliability can be assessed without depending on a live API key or network access.</w:t>
-      </w:r>
-    </w:p>
-    <w:p/>
-    <w:p>
-      <w:r>
-        <w:rPr>
-          <w:rFonts w:ascii="Helvetica" w:hAnsi="Helvetica" w:cs="Helvetica"/>
-          <w:b/>
-        </w:rPr>
-        <w:t>Evidence Links</w:t>
-      </w:r>
-    </w:p>
-    <w:p>
-      <w:r>
-        <w:rPr>
-          <w:rFonts w:ascii="Helvetica" w:hAnsi="Helvetica" w:cs="Helvetica"/>
-        </w:rPr>
-        <w:t xml:space="preserve">Meeting notes and reflective discussion: </w:t>
-      </w:r>
-      <w:r>
-        <w:rPr>
-          <w:rFonts w:ascii="Courier New" w:hAnsi="Courier New" w:cs="Courier New"/>
-        </w:rPr>
-        <w:t>Documents/Meetings Journal</w:t>
-      </w:r>
-    </w:p>
-    <w:p>
-      <w:r>
-        <w:rPr>
-          <w:rFonts w:ascii="Arial" w:hAnsi="Arial" w:cs="Arial"/>
-        </w:rPr>
-        <w:lastRenderedPageBreak/>
-        <w:t xml:space="preserve">User feedback and prioritised improvements: </w:t>
-      </w:r>
-      <w:r>
-        <w:rPr>
-          <w:rFonts w:ascii="Courier New" w:hAnsi="Courier New" w:cs="Courier New"/>
-        </w:rPr>
-        <w:t>Documents/User Feedback and Interview Questions.docx</w:t>
-      </w:r>
-    </w:p>
-    <w:p>
-      <w:r>
-        <w:rPr>
-          <w:rFonts w:ascii="Arial" w:hAnsi="Arial" w:cs="Arial"/>
-        </w:rPr>
-        <w:t xml:space="preserve">Sprint/task tracking: </w:t>
-      </w:r>
-      <w:r>
-        <w:rPr>
-          <w:rFonts w:ascii="Courier New" w:hAnsi="Courier New" w:cs="Courier New"/>
-        </w:rPr>
-        <w:t>Documents/CAB302 Software Project Management 389bfd0f43e648a895758d4198331dbc.csv</w:t>
-      </w:r>
-    </w:p>
-    <w:p>
-      <w:r>
-        <w:rPr>
-          <w:rFonts w:ascii="Arial" w:hAnsi="Arial" w:cs="Arial"/>
-        </w:rPr>
-        <w:t xml:space="preserve">Commit evidence of feedback-driven fixes: </w:t>
-      </w:r>
-      <w:r>
-        <w:rPr>
-          <w:rFonts w:ascii="Courier New" w:hAnsi="Courier New" w:cs="Courier New"/>
-        </w:rPr>
-        <w:t>Documents/Git Commit History.txt</w:t>
-      </w:r>
-    </w:p>
-    <w:p>
-      <w:r>
-        <w:rPr>
-          <w:rFonts w:ascii="Arial" w:hAnsi="Arial" w:cs="Arial"/>
-        </w:rPr>
-        <w:t xml:space="preserve">Coverage evidence: </w:t>
-      </w:r>
-      <w:r>
-        <w:rPr>
-          <w:rFonts w:ascii="Courier New" w:hAnsi="Courier New" w:cs="Courier New"/>
-        </w:rPr>
-        <w:t>target/site/</w:t>
-      </w:r>
-      <w:proofErr w:type="spellStart"/>
-      <w:r>
-        <w:rPr>
-          <w:rFonts w:ascii="Courier New" w:hAnsi="Courier New" w:cs="Courier New"/>
-        </w:rPr>
-        <w:t>jacoco</w:t>
-      </w:r>
-      <w:proofErr w:type="spellEnd"/>
-      <w:r>
-        <w:rPr>
-          <w:rFonts w:ascii="Courier New" w:hAnsi="Courier New" w:cs="Courier New"/>
+          <w:rFonts w:ascii="Arial" w:hAnsi="Arial" w:cs="Arial"/>
+          <w:sz w:val="20"/>
+          <w:szCs w:val="20"/>
         </w:rPr>
         <w:t>/index.html</w:t>
       </w:r>

</xml_diff>